<commit_message>
seed data and protected routes
</commit_message>
<xml_diff>
--- a/skills/CRM.docx
+++ b/skills/CRM.docx
@@ -272,11 +272,44 @@
     </w:p>
     <w:p>
       <w:pPr>
-        <w:ind w:left="360"/>
-        <w:rPr>
-          <w:lang w:val="en-US"/>
-        </w:rPr>
-      </w:pPr>
+        <w:rPr>
+          <w:lang w:val="en-US"/>
+        </w:rPr>
+      </w:pPr>
+    </w:p>
+    <w:p>
+      <w:pPr>
+        <w:rPr>
+          <w:lang w:val="en-US"/>
+        </w:rPr>
+      </w:pPr>
+    </w:p>
+    <w:p>
+      <w:pPr>
+        <w:rPr>
+          <w:lang w:val="en-US"/>
+        </w:rPr>
+      </w:pPr>
+      <w:r>
+        <w:rPr>
+          <w:lang w:val="en-US"/>
+        </w:rPr>
+        <w:t xml:space="preserve">Whenever someone registers a company then a </w:t>
+      </w:r>
+      <w:proofErr w:type="spellStart"/>
+      <w:r>
+        <w:rPr>
+          <w:lang w:val="en-US"/>
+        </w:rPr>
+        <w:t>tenantId</w:t>
+      </w:r>
+      <w:proofErr w:type="spellEnd"/>
+      <w:r>
+        <w:rPr>
+          <w:lang w:val="en-US"/>
+        </w:rPr>
+        <w:t xml:space="preserve"> would be created for that company, the first signup will be admin and only he will create new users, and give access to them to access the CRM.</w:t>
+      </w:r>
     </w:p>
     <w:sectPr>
       <w:pgSz w:w="11906" w:h="16838"/>

</xml_diff>